<commit_message>
Versão de submissão: declaração de IA e ajuste na cover letter
PDF recompilado a partir do .tex atual, agora com a seção "Declaration of
generative AI in scientific writing" exigida pela política da Elsevier.

Cover letter passa a dizer "a real, de-identified Cerrado gas-exchange
campaign", coerente com a legenda da Figura 3, que também deixou de usar
"real" isolado.

O documento interno de verificação fica fora do versionamento.

Co-Authored-By: Claude Opus 5 <noreply@anthropic.com>
</commit_message>
<xml_diff>
--- a/cover_letter_software_impacts.docx
+++ b/cover_letter_software_impacts.docx
@@ -91,7 +91,10 @@
         <w:t xml:space="preserve">a real, de-identified Cerrado gas-exchange </w:t>
       </w:r>
       <w:r>
-        <w:t xml:space="preserve">Campaign </w:t>
+        <w:t>c</w:t>
+      </w:r>
+      <w:r>
+        <w:t xml:space="preserve">ampaign </w:t>
       </w:r>
       <w:r>
         <w:t xml:space="preserve">and with two public datasets from agronomy and biology, including a split-plot analysis that reproduces the R reference fit to the decimal. The software is released under GPL-2.0 (an OSI-recognised license) and is freely and publicly available at </w:t>

</xml_diff>